<commit_message>
Harmonize experience descriptions with LinkedIn and the CV
- Same bullets and Stack line as LinkedIn for every job (FR / EN / AR)
- CCM Benchmark shown as part of the Le Figaro group, Core team of Lead
  Developers supporting the other squads (Akamai cache tags, data imports)
- Keytchens phases: platform built alone from Tunisia as a freelancer, then
  order aggregator, team hiring and agile rituals once permanent
- Matalto as the employer (assignment at Manymore), Mobelite Kafka module,
  Argolife P/T Slider app
- CV.pdf / CV.docx regenerated with the same texts
</commit_message>
<xml_diff>
--- a/public/CV.docx
+++ b/public/CV.docx
@@ -38,7 +38,7 @@
       <w:pPr>
         <w:spacing w:after="40"/>
       </w:pPr>
-      <w:hyperlink w:history="1" r:id="rIdcdf_ca_iliqdp1snoxd4v">
+      <w:hyperlink w:history="1" r:id="rId4lafa8nj3gqcyrx4xszv5">
         <w:r>
           <w:rPr>
             <w:rFonts w:ascii="Arial" w:cs="Arial" w:eastAsia="Arial" w:hAnsi="Arial"/>
@@ -63,7 +63,7 @@
       <w:pPr>
         <w:spacing w:after="120"/>
       </w:pPr>
-      <w:hyperlink w:history="1" r:id="rIddnrsaydeaymtp3tizombj">
+      <w:hyperlink w:history="1" r:id="rIdmzkazacr-uhiu0vjqwftz">
         <w:r>
           <w:rPr>
             <w:rFonts w:ascii="Arial" w:cs="Arial" w:eastAsia="Arial" w:hAnsi="Arial"/>
@@ -83,7 +83,7 @@
         </w:rPr>
         <w:t xml:space="preserve">   ·   </w:t>
       </w:r>
-      <w:hyperlink w:history="1" r:id="rIdlpydjbavltfyl48e3tznv">
+      <w:hyperlink w:history="1" r:id="rIdzffkqhlaygdvzcqsul22x">
         <w:r>
           <w:rPr>
             <w:rFonts w:ascii="Arial" w:cs="Arial" w:eastAsia="Arial" w:hAnsi="Arial"/>
@@ -103,7 +103,7 @@
         </w:rPr>
         <w:t xml:space="preserve">   ·   </w:t>
       </w:r>
-      <w:hyperlink w:history="1" r:id="rIdp7ge1xqnhcljzsff8nb5r">
+      <w:hyperlink w:history="1" r:id="rIdrqbw0cfhsctuetisetk5y">
         <w:r>
           <w:rPr>
             <w:rFonts w:ascii="Arial" w:cs="Arial" w:eastAsia="Arial" w:hAnsi="Arial"/>
@@ -123,7 +123,7 @@
         </w:rPr>
         <w:t xml:space="preserve">   ·   </w:t>
       </w:r>
-      <w:hyperlink w:history="1" r:id="rId2u8betuy-umjobm3lrg3x">
+      <w:hyperlink w:history="1" r:id="rIdluh7ud7r-qixvu-n8wa-l">
         <w:r>
           <w:rPr>
             <w:rFonts w:ascii="Arial" w:cs="Arial" w:eastAsia="Arial" w:hAnsi="Arial"/>
@@ -205,7 +205,7 @@
       </w:pPr>
       <w:r>
         <w:drawing>
-          <wp:anchor distT="0" distB="0" distL="0" distR="0" simplePos="0" allowOverlap="1" behindDoc="1" locked="0" layoutInCell="1" relativeHeight="2044732">
+          <wp:anchor distT="0" distB="0" distL="0" distR="0" simplePos="0" allowOverlap="1" behindDoc="1" locked="0" layoutInCell="1" relativeHeight="2336768">
             <wp:simplePos x="0" y="0"/>
             <wp:positionH relativeFrom="margin">
               <wp:posOffset>0</wp:posOffset>
@@ -213,7 +213,7 @@
             <wp:positionV relativeFrom="paragraph">
               <wp:posOffset>-50800</wp:posOffset>
             </wp:positionV>
-            <wp:extent cx="431768" cy="2044732"/>
+            <wp:extent cx="431768" cy="2336768"/>
             <wp:effectExtent t="0" r="0" b="0" l="0"/>
             <wp:wrapNone/>
             <wp:docPr id="1" name="git-ORPI" descr="Graphe du parcours : ORPI" title="Parcours"/>
@@ -239,7 +239,7 @@
                   <pic:spPr bwMode="auto">
                     <a:xfrm>
                       <a:off x="0" y="0"/>
-                      <a:ext cx="431768" cy="2044732"/>
+                      <a:ext cx="431768" cy="2336768"/>
                     </a:xfrm>
                     <a:prstGeom prst="rect">
                       <a:avLst/>
@@ -319,7 +319,7 @@
           <w:sz w:val="18"/>
           <w:szCs w:val="18"/>
         </w:rPr>
-        <w:t xml:space="preserve">Pilotage de plusieurs projets SI en parallèle : cadrage, recueil des besoins, spécifications, planning et suivi des livrables.</w:t>
+        <w:t xml:space="preserve">Pilotage de plusieurs projets SI en parallèle : cadrage, recueil des besoins, spécifications, planning et suivi des livrables</w:t>
       </w:r>
     </w:p>
     <w:p>
@@ -340,7 +340,7 @@
           <w:sz w:val="18"/>
           <w:szCs w:val="18"/>
         </w:rPr>
-        <w:t xml:space="preserve">Conception et développement d'OrpiHub, la plateforme data du réseau : pilotage commercial, cartographie, exports, audits d'agence.</w:t>
+        <w:t xml:space="preserve">Conception et développement d'OrpiHub, la plateforme data du réseau : pilotage commercial, cartographie, exports, audits d'agence</w:t>
       </w:r>
     </w:p>
     <w:p>
@@ -361,7 +361,7 @@
           <w:sz w:val="18"/>
           <w:szCs w:val="18"/>
         </w:rPr>
-        <w:t xml:space="preserve">Assistant métier IA : agents LLM, plus de 120 outils métier, serveur MCP en production, plugin Claude pour les équipes ; RAG sur la documentation interne.</w:t>
+        <w:t xml:space="preserve">Assistant métier IA : agents LLM, plus de 120 outils métier, serveur MCP en production, plugin Claude pour les équipes</w:t>
       </w:r>
     </w:p>
     <w:p>
@@ -382,7 +382,7 @@
           <w:sz w:val="18"/>
           <w:szCs w:val="18"/>
         </w:rPr>
-        <w:t xml:space="preserve">Extraction et consolidation des chiffres du réseau (CA, mandats, ventes, GIE) ; création de KPI et de notes de synthèse pour la direction.</w:t>
+        <w:t xml:space="preserve">RAG sur la documentation métier et comptes rendus d'audit générés par IA</w:t>
       </w:r>
     </w:p>
     <w:p>
@@ -403,13 +403,13 @@
           <w:sz w:val="18"/>
           <w:szCs w:val="18"/>
         </w:rPr>
-        <w:t xml:space="preserve">Fiabilisation des données CRM (SweepBright, JEMS), cartographie des flux entre outils (Ubiflow, Digitaleo, ActiveCampaign, Modelo), automatisations API, conformité RGPD.</w:t>
+        <w:t xml:space="preserve">Extraction et consolidation des chiffres du réseau (CA, mandats, ventes, GIE), KPI et notes de synthèse pour la direction</w:t>
       </w:r>
     </w:p>
     <w:p>
       <w:pPr>
         <w:pStyle w:val="ListParagraph"/>
-        <w:keepNext w:val="false"/>
+        <w:keepNext/>
         <w:keepLines/>
         <w:numPr>
           <w:ilvl w:val="0"/>
@@ -424,7 +424,54 @@
           <w:sz w:val="18"/>
           <w:szCs w:val="18"/>
         </w:rPr>
-        <w:t xml:space="preserve">Documentation fonctionnelle, formation et support des équipes métier.</w:t>
+        <w:t xml:space="preserve">Fiabilisation des données CRM (SweepBright, JEMS), cartographie des flux entre outils (Ubiflow, Digitaleo, ActiveCampaign, Modelo), automatisations API, conformité RGPD</w:t>
+      </w:r>
+    </w:p>
+    <w:p>
+      <w:pPr>
+        <w:pStyle w:val="ListParagraph"/>
+        <w:keepNext/>
+        <w:keepLines/>
+        <w:numPr>
+          <w:ilvl w:val="0"/>
+          <w:numId w:val="2"/>
+        </w:numPr>
+        <w:spacing w:after="20" w:line="252"/>
+      </w:pPr>
+      <w:r>
+        <w:rPr>
+          <w:rFonts w:ascii="Arial" w:cs="Arial" w:eastAsia="Arial" w:hAnsi="Arial"/>
+          <w:color w:val="374151"/>
+          <w:sz w:val="18"/>
+          <w:szCs w:val="18"/>
+        </w:rPr>
+        <w:t xml:space="preserve">Documentation fonctionnelle, formation et support des équipes métier</w:t>
+      </w:r>
+    </w:p>
+    <w:p>
+      <w:pPr>
+        <w:spacing w:after="20" w:before="20"/>
+        <w:ind w:left="760"/>
+      </w:pPr>
+      <w:r>
+        <w:rPr>
+          <w:rFonts w:ascii="Arial" w:cs="Arial" w:eastAsia="Arial" w:hAnsi="Arial"/>
+          <w:b/>
+          <w:bCs/>
+          <w:color w:val="111827"/>
+          <w:sz w:val="17"/>
+          <w:szCs w:val="17"/>
+        </w:rPr>
+        <w:t xml:space="preserve">Stack : </w:t>
+      </w:r>
+      <w:r>
+        <w:rPr>
+          <w:rFonts w:ascii="Arial" w:cs="Arial" w:eastAsia="Arial" w:hAnsi="Arial"/>
+          <w:color w:val="6B7280"/>
+          <w:sz w:val="17"/>
+          <w:szCs w:val="17"/>
+        </w:rPr>
+        <w:t xml:space="preserve">Symfony, PHP 8, React, TypeScript, GraphQL, SQL Server, MySQL, PostgreSQL, BigQuery, Docker</w:t>
       </w:r>
     </w:p>
     <w:p>
@@ -438,7 +485,7 @@
       </w:pPr>
       <w:r>
         <w:drawing>
-          <wp:anchor distT="0" distB="0" distL="0" distR="0" simplePos="0" allowOverlap="1" behindDoc="1" locked="0" layoutInCell="1" relativeHeight="1168432">
+          <wp:anchor distT="0" distB="0" distL="0" distR="0" simplePos="0" allowOverlap="1" behindDoc="1" locked="0" layoutInCell="1" relativeHeight="1447800">
             <wp:simplePos x="0" y="0"/>
             <wp:positionH relativeFrom="margin">
               <wp:posOffset>0</wp:posOffset>
@@ -446,7 +493,7 @@
             <wp:positionV relativeFrom="paragraph">
               <wp:posOffset>-50800</wp:posOffset>
             </wp:positionV>
-            <wp:extent cx="431768" cy="1168432"/>
+            <wp:extent cx="431768" cy="1447800"/>
             <wp:effectExtent t="0" r="0" b="0" l="0"/>
             <wp:wrapNone/>
             <wp:docPr id="2" name="git-CCM" descr="Graphe du parcours : CCM" title="Parcours"/>
@@ -472,7 +519,7 @@
                   <pic:spPr bwMode="auto">
                     <a:xfrm>
                       <a:off x="0" y="0"/>
-                      <a:ext cx="431768" cy="1168432"/>
+                      <a:ext cx="431768" cy="1447800"/>
                     </a:xfrm>
                     <a:prstGeom prst="rect">
                       <a:avLst/>
@@ -531,7 +578,7 @@
           <w:sz w:val="18"/>
           <w:szCs w:val="18"/>
         </w:rPr>
-        <w:t xml:space="preserve">  ·  Paris</w:t>
+        <w:t xml:space="preserve">  ·  Paris · équipe Core</w:t>
       </w:r>
     </w:p>
     <w:p>
@@ -552,7 +599,7 @@
           <w:sz w:val="18"/>
           <w:szCs w:val="18"/>
         </w:rPr>
-        <w:t xml:space="preserve">Développement et maintenance de produits internes essentiels à l'entreprise.</w:t>
+        <w:t xml:space="preserve">Lead Developer au sein de l'équipe Core, composée de Lead Developers, qui intervient sur tous les projets et accompagne les autres squads</w:t>
       </w:r>
     </w:p>
     <w:p>
@@ -573,7 +620,7 @@
           <w:sz w:val="18"/>
           <w:szCs w:val="18"/>
         </w:rPr>
-        <w:t xml:space="preserve">Encadrement et soutien technique d'autres équipes de développement.</w:t>
+        <w:t xml:space="preserve">Mise en place de tags de cache sur Akamai pour purger le cache de façon ciblée</w:t>
       </w:r>
     </w:p>
     <w:p>
@@ -594,13 +641,13 @@
           <w:sz w:val="18"/>
           <w:szCs w:val="18"/>
         </w:rPr>
-        <w:t xml:space="preserve">PHP natif, Symfony (plusieurs versions) et API Platform ; environnements Docker pour le déploiement et l'intégration continue.</w:t>
+        <w:t xml:space="preserve">Développement des imports de données internes</w:t>
       </w:r>
     </w:p>
     <w:p>
       <w:pPr>
         <w:pStyle w:val="ListParagraph"/>
-        <w:keepNext w:val="false"/>
+        <w:keepNext/>
         <w:keepLines/>
         <w:numPr>
           <w:ilvl w:val="0"/>
@@ -615,7 +662,33 @@
           <w:sz w:val="18"/>
           <w:szCs w:val="18"/>
         </w:rPr>
-        <w:t xml:space="preserve">Conception d'outils internes pour les équipes métier, veille technologique.</w:t>
+        <w:t xml:space="preserve">PHP natif, Symfony (plusieurs versions) et API Platform ; environnements Docker pour le déploiement et l'intégration continue</w:t>
+      </w:r>
+    </w:p>
+    <w:p>
+      <w:pPr>
+        <w:spacing w:after="20" w:before="20"/>
+        <w:ind w:left="760"/>
+      </w:pPr>
+      <w:r>
+        <w:rPr>
+          <w:rFonts w:ascii="Arial" w:cs="Arial" w:eastAsia="Arial" w:hAnsi="Arial"/>
+          <w:b/>
+          <w:bCs/>
+          <w:color w:val="111827"/>
+          <w:sz w:val="17"/>
+          <w:szCs w:val="17"/>
+        </w:rPr>
+        <w:t xml:space="preserve">Stack : </w:t>
+      </w:r>
+      <w:r>
+        <w:rPr>
+          <w:rFonts w:ascii="Arial" w:cs="Arial" w:eastAsia="Arial" w:hAnsi="Arial"/>
+          <w:color w:val="6B7280"/>
+          <w:sz w:val="17"/>
+          <w:szCs w:val="17"/>
+        </w:rPr>
+        <w:t xml:space="preserve">PHP, Symfony, API Platform, Akamai, Docker, MySQL</w:t>
       </w:r>
     </w:p>
     <w:p>
@@ -629,7 +702,7 @@
       </w:pPr>
       <w:r>
         <w:drawing>
-          <wp:anchor distT="0" distB="0" distL="0" distR="0" simplePos="0" allowOverlap="1" behindDoc="1" locked="0" layoutInCell="1" relativeHeight="1892332">
+          <wp:anchor distT="0" distB="0" distL="0" distR="0" simplePos="0" allowOverlap="1" behindDoc="1" locked="0" layoutInCell="1" relativeHeight="2031968">
             <wp:simplePos x="0" y="0"/>
             <wp:positionH relativeFrom="margin">
               <wp:posOffset>0</wp:posOffset>
@@ -637,7 +710,7 @@
             <wp:positionV relativeFrom="paragraph">
               <wp:posOffset>-50800</wp:posOffset>
             </wp:positionV>
-            <wp:extent cx="431768" cy="1892332"/>
+            <wp:extent cx="431768" cy="2031968"/>
             <wp:effectExtent t="0" r="0" b="0" l="0"/>
             <wp:wrapNone/>
             <wp:docPr id="3" name="git-KEY" descr="Graphe du parcours : KEY" title="Parcours"/>
@@ -663,7 +736,7 @@
                   <pic:spPr bwMode="auto">
                     <a:xfrm>
                       <a:off x="0" y="0"/>
-                      <a:ext cx="431768" cy="1892332"/>
+                      <a:ext cx="431768" cy="2031968"/>
                     </a:xfrm>
                     <a:prstGeom prst="rect">
                       <a:avLst/>
@@ -763,7 +836,7 @@
           <w:sz w:val="18"/>
           <w:szCs w:val="18"/>
         </w:rPr>
-        <w:t xml:space="preserve"> — développement web en parallèle de mes postes en Tunisie puis chez Matalto</w:t>
+        <w:t xml:space="preserve"> — plateforme développée seul depuis la Tunisie : facturation Uber Eats reconstituée par scraping, e-mails explicatifs aux restaurateurs sur leurs factures Uber Eats et Deliveroo</w:t>
       </w:r>
     </w:p>
     <w:p>
@@ -804,7 +877,7 @@
           <w:sz w:val="18"/>
           <w:szCs w:val="18"/>
         </w:rPr>
-        <w:t xml:space="preserve"> — Développeur Symfony / React (09/2020 – 10/2021), puis Tech Lead PHP/Symfony, ReactJS, GraphQL (10/2021 – 08/2024)</w:t>
+        <w:t xml:space="preserve"> — Développeur Symfony / React (09/2020 – 10/2021) : lancement de l'agrégateur de commandes, recrutement de l'équipe, Jira, daily et rétrospectives ; puis Tech Lead (10/2021 – 08/2024)</w:t>
       </w:r>
     </w:p>
     <w:p>
@@ -825,7 +898,7 @@
           <w:sz w:val="18"/>
           <w:szCs w:val="18"/>
         </w:rPr>
-        <w:t xml:space="preserve">Migration de Symfony 2.8 vers 6.4 sans interruption de service.</w:t>
+        <w:t xml:space="preserve">Migration de Symfony 2.8 vers 6.4 sans interruption de service</w:t>
       </w:r>
     </w:p>
     <w:p>
@@ -846,7 +919,7 @@
           <w:sz w:val="18"/>
           <w:szCs w:val="18"/>
         </w:rPr>
-        <w:t xml:space="preserve">Direction d'une équipe de 4 développeurs : attribution des tâches (JIRA), revue de code, qualité des livrables.</w:t>
+        <w:t xml:space="preserve">Direction d'une équipe de 4 développeurs : attribution des tâches (JIRA), revue de code, qualité des livrables</w:t>
       </w:r>
     </w:p>
     <w:p>
@@ -867,7 +940,7 @@
           <w:sz w:val="18"/>
           <w:szCs w:val="18"/>
         </w:rPr>
-        <w:t xml:space="preserve">Intégration des API Uber Eats et Deliveroo, gestion en temps réel des commandes, impression cloud et Bluetooth.</w:t>
+        <w:t xml:space="preserve">Intégration des API Uber Eats et Deliveroo, gestion en temps réel des commandes ; impression cloud et Bluetooth</w:t>
       </w:r>
     </w:p>
     <w:p>
@@ -888,13 +961,13 @@
           <w:sz w:val="18"/>
           <w:szCs w:val="18"/>
         </w:rPr>
-        <w:t xml:space="preserve">Applications Symfony, ReactJS et Ionic Capacitor ; GraphQL.</w:t>
+        <w:t xml:space="preserve">Applications Symfony, ReactJS et Ionic Capacitor ; API GraphQL</w:t>
       </w:r>
     </w:p>
     <w:p>
       <w:pPr>
         <w:pStyle w:val="ListParagraph"/>
-        <w:keepNext w:val="false"/>
+        <w:keepNext/>
         <w:keepLines/>
         <w:numPr>
           <w:ilvl w:val="0"/>
@@ -909,7 +982,33 @@
           <w:sz w:val="18"/>
           <w:szCs w:val="18"/>
         </w:rPr>
-        <w:t xml:space="preserve">Infrastructure multi-serveurs Debian/Ubuntu à fort trafic : Jenkins, Docker, Redis, MySQL, Apache2, Postfix, Sentry.</w:t>
+        <w:t xml:space="preserve">Infrastructure multi-serveurs Debian/Ubuntu à fort trafic : Jenkins, Docker, Redis, MySQL, Apache2, Postfix, Sentry</w:t>
+      </w:r>
+    </w:p>
+    <w:p>
+      <w:pPr>
+        <w:spacing w:after="20" w:before="20"/>
+        <w:ind w:left="760"/>
+      </w:pPr>
+      <w:r>
+        <w:rPr>
+          <w:rFonts w:ascii="Arial" w:cs="Arial" w:eastAsia="Arial" w:hAnsi="Arial"/>
+          <w:b/>
+          <w:bCs/>
+          <w:color w:val="111827"/>
+          <w:sz w:val="17"/>
+          <w:szCs w:val="17"/>
+        </w:rPr>
+        <w:t xml:space="preserve">Stack : </w:t>
+      </w:r>
+      <w:r>
+        <w:rPr>
+          <w:rFonts w:ascii="Arial" w:cs="Arial" w:eastAsia="Arial" w:hAnsi="Arial"/>
+          <w:color w:val="6B7280"/>
+          <w:sz w:val="17"/>
+          <w:szCs w:val="17"/>
+        </w:rPr>
+        <w:t xml:space="preserve">PHP 7.4, Symfony 2.8 → 6.4, ReactJS, Ionic Capacitor, GraphQL, MySQL, Redis, Docker, Jenkins, Sentry, JIRA</w:t>
       </w:r>
     </w:p>
     <w:p>
@@ -923,7 +1022,7 @@
       </w:pPr>
       <w:r>
         <w:drawing>
-          <wp:anchor distT="0" distB="0" distL="0" distR="0" simplePos="0" allowOverlap="1" behindDoc="1" locked="0" layoutInCell="1" relativeHeight="876300">
+          <wp:anchor distT="0" distB="0" distL="0" distR="0" simplePos="0" allowOverlap="1" behindDoc="1" locked="0" layoutInCell="1" relativeHeight="1028700">
             <wp:simplePos x="0" y="0"/>
             <wp:positionH relativeFrom="margin">
               <wp:posOffset>0</wp:posOffset>
@@ -931,7 +1030,7 @@
             <wp:positionV relativeFrom="paragraph">
               <wp:posOffset>-50800</wp:posOffset>
             </wp:positionV>
-            <wp:extent cx="431768" cy="876300"/>
+            <wp:extent cx="431768" cy="1028700"/>
             <wp:effectExtent t="0" r="0" b="0" l="0"/>
             <wp:wrapNone/>
             <wp:docPr id="4" name="git-MAT" descr="Graphe du parcours : MAT" title="Parcours"/>
@@ -957,7 +1056,7 @@
                   <pic:spPr bwMode="auto">
                     <a:xfrm>
                       <a:off x="0" y="0"/>
-                      <a:ext cx="431768" cy="876300"/>
+                      <a:ext cx="431768" cy="1028700"/>
                     </a:xfrm>
                     <a:prstGeom prst="rect">
                       <a:avLst/>
@@ -978,7 +1077,7 @@
           <w:sz w:val="21"/>
           <w:szCs w:val="21"/>
         </w:rPr>
-        <w:t xml:space="preserve">Développeur Symfony (consultant)</w:t>
+        <w:t xml:space="preserve">Consultant PHP Symfony (mission chez Manymore)</w:t>
       </w:r>
       <w:r>
         <w:rPr>
@@ -1007,7 +1106,7 @@
           <w:sz w:val="19"/>
           <w:szCs w:val="19"/>
         </w:rPr>
-        <w:t xml:space="preserve">Matalto – mission chez Manymore</w:t>
+        <w:t xml:space="preserve">Matalto</w:t>
       </w:r>
       <w:r>
         <w:rPr>
@@ -1037,7 +1136,7 @@
           <w:sz w:val="18"/>
           <w:szCs w:val="18"/>
         </w:rPr>
-        <w:t xml:space="preserve">Migration de Symfony 2.8 vers 3.4.</w:t>
+        <w:t xml:space="preserve">Migration de Symfony 2.8 vers 3.4</w:t>
       </w:r>
     </w:p>
     <w:p>
@@ -1058,13 +1157,13 @@
           <w:sz w:val="18"/>
           <w:szCs w:val="18"/>
         </w:rPr>
-        <w:t xml:space="preserve">Maintenance corrective (TMA) et amélioration des performances.</w:t>
+        <w:t xml:space="preserve">Maintenance corrective (TMA) et amélioration des performances</w:t>
       </w:r>
     </w:p>
     <w:p>
       <w:pPr>
         <w:pStyle w:val="ListParagraph"/>
-        <w:keepNext w:val="false"/>
+        <w:keepNext/>
         <w:keepLines/>
         <w:numPr>
           <w:ilvl w:val="0"/>
@@ -1079,7 +1178,33 @@
           <w:sz w:val="18"/>
           <w:szCs w:val="18"/>
         </w:rPr>
-        <w:t xml:space="preserve">Étude et mise en œuvre de GraphQL.</w:t>
+        <w:t xml:space="preserve">Étude et mise en œuvre de GraphQL pour optimiser l'accès aux données</w:t>
+      </w:r>
+    </w:p>
+    <w:p>
+      <w:pPr>
+        <w:spacing w:after="20" w:before="20"/>
+        <w:ind w:left="760"/>
+      </w:pPr>
+      <w:r>
+        <w:rPr>
+          <w:rFonts w:ascii="Arial" w:cs="Arial" w:eastAsia="Arial" w:hAnsi="Arial"/>
+          <w:b/>
+          <w:bCs/>
+          <w:color w:val="111827"/>
+          <w:sz w:val="17"/>
+          <w:szCs w:val="17"/>
+        </w:rPr>
+        <w:t xml:space="preserve">Stack : </w:t>
+      </w:r>
+      <w:r>
+        <w:rPr>
+          <w:rFonts w:ascii="Arial" w:cs="Arial" w:eastAsia="Arial" w:hAnsi="Arial"/>
+          <w:color w:val="6B7280"/>
+          <w:sz w:val="17"/>
+          <w:szCs w:val="17"/>
+        </w:rPr>
+        <w:t xml:space="preserve">PHP, Symfony 2.8 / 3.4, GraphQL, Git</w:t>
       </w:r>
     </w:p>
     <w:p>
@@ -1093,15 +1218,15 @@
       </w:pPr>
       <w:r>
         <w:drawing>
-          <wp:anchor distT="0" distB="0" distL="0" distR="0" simplePos="0" allowOverlap="1" behindDoc="1" locked="0" layoutInCell="1" relativeHeight="876300">
+          <wp:anchor distT="0" distB="0" distL="0" distR="0" simplePos="0" allowOverlap="1" behindDoc="1" locked="0" layoutInCell="1" relativeHeight="1244632">
             <wp:simplePos x="0" y="0"/>
             <wp:positionH relativeFrom="margin">
               <wp:posOffset>0</wp:posOffset>
             </wp:positionH>
             <wp:positionV relativeFrom="paragraph">
-              <wp:posOffset>-50800</wp:posOffset>
+              <wp:posOffset>-279400</wp:posOffset>
             </wp:positionV>
-            <wp:extent cx="431768" cy="876300"/>
+            <wp:extent cx="431768" cy="1244632"/>
             <wp:effectExtent t="0" r="0" b="0" l="0"/>
             <wp:wrapNone/>
             <wp:docPr id="5" name="git-MOB" descr="Graphe du parcours : MOB" title="Parcours"/>
@@ -1127,7 +1252,7 @@
                   <pic:spPr bwMode="auto">
                     <a:xfrm>
                       <a:off x="0" y="0"/>
-                      <a:ext cx="431768" cy="876300"/>
+                      <a:ext cx="431768" cy="1244632"/>
                     </a:xfrm>
                     <a:prstGeom prst="rect">
                       <a:avLst/>
@@ -1207,7 +1332,7 @@
           <w:sz w:val="18"/>
           <w:szCs w:val="18"/>
         </w:rPr>
-        <w:t xml:space="preserve">Applications Symfony et Node.js.</w:t>
+        <w:t xml:space="preserve">Développement d'un module Symfony qui consomme et lit les messages d'Apache Kafka</w:t>
       </w:r>
     </w:p>
     <w:p>
@@ -1228,13 +1353,13 @@
           <w:sz w:val="18"/>
           <w:szCs w:val="18"/>
         </w:rPr>
-        <w:t xml:space="preserve">Nouveau système d'envoi de notifications push.</w:t>
+        <w:t xml:space="preserve">Conception et développement d'applications avec Symfony et Node.js</w:t>
       </w:r>
     </w:p>
     <w:p>
       <w:pPr>
         <w:pStyle w:val="ListParagraph"/>
-        <w:keepNext w:val="false"/>
+        <w:keepNext/>
         <w:keepLines/>
         <w:numPr>
           <w:ilvl w:val="0"/>
@@ -1249,7 +1374,33 @@
           <w:sz w:val="18"/>
           <w:szCs w:val="18"/>
         </w:rPr>
-        <w:t xml:space="preserve">Étude d'Apache Kafka pour le traitement de flux.</w:t>
+        <w:t xml:space="preserve">Nouveau système d'envoi de notifications push</w:t>
+      </w:r>
+    </w:p>
+    <w:p>
+      <w:pPr>
+        <w:spacing w:after="20" w:before="20"/>
+        <w:ind w:left="760"/>
+      </w:pPr>
+      <w:r>
+        <w:rPr>
+          <w:rFonts w:ascii="Arial" w:cs="Arial" w:eastAsia="Arial" w:hAnsi="Arial"/>
+          <w:b/>
+          <w:bCs/>
+          <w:color w:val="111827"/>
+          <w:sz w:val="17"/>
+          <w:szCs w:val="17"/>
+        </w:rPr>
+        <w:t xml:space="preserve">Stack : </w:t>
+      </w:r>
+      <w:r>
+        <w:rPr>
+          <w:rFonts w:ascii="Arial" w:cs="Arial" w:eastAsia="Arial" w:hAnsi="Arial"/>
+          <w:color w:val="6B7280"/>
+          <w:sz w:val="17"/>
+          <w:szCs w:val="17"/>
+        </w:rPr>
+        <w:t xml:space="preserve">Symfony, Apache Kafka, Node.js, Linux, Git</w:t>
       </w:r>
     </w:p>
     <w:p>
@@ -1263,15 +1414,15 @@
       </w:pPr>
       <w:r>
         <w:drawing>
-          <wp:anchor distT="0" distB="0" distL="0" distR="0" simplePos="0" allowOverlap="1" behindDoc="1" locked="0" layoutInCell="1" relativeHeight="1104900">
+          <wp:anchor distT="0" distB="0" distL="0" distR="0" simplePos="0" allowOverlap="1" behindDoc="1" locked="0" layoutInCell="1" relativeHeight="1016032">
             <wp:simplePos x="0" y="0"/>
             <wp:positionH relativeFrom="margin">
               <wp:posOffset>0</wp:posOffset>
             </wp:positionH>
             <wp:positionV relativeFrom="paragraph">
-              <wp:posOffset>-279400</wp:posOffset>
+              <wp:posOffset>-50800</wp:posOffset>
             </wp:positionV>
-            <wp:extent cx="431768" cy="1104900"/>
+            <wp:extent cx="431768" cy="1016032"/>
             <wp:effectExtent t="0" r="0" b="0" l="0"/>
             <wp:wrapNone/>
             <wp:docPr id="6" name="git-PIX" descr="Graphe du parcours : PIX" title="Parcours"/>
@@ -1297,7 +1448,7 @@
                   <pic:spPr bwMode="auto">
                     <a:xfrm>
                       <a:off x="0" y="0"/>
-                      <a:ext cx="431768" cy="1104900"/>
+                      <a:ext cx="431768" cy="1016032"/>
                     </a:xfrm>
                     <a:prstGeom prst="rect">
                       <a:avLst/>
@@ -1377,7 +1528,7 @@
           <w:sz w:val="18"/>
           <w:szCs w:val="18"/>
         </w:rPr>
-        <w:t xml:space="preserve">Applications Symfony 2.8 et Python.</w:t>
+        <w:t xml:space="preserve">Développement d'applications en Symfony 2.8 et Python</w:t>
       </w:r>
     </w:p>
     <w:p>
@@ -1398,13 +1549,13 @@
           <w:sz w:val="18"/>
           <w:szCs w:val="18"/>
         </w:rPr>
-        <w:t xml:space="preserve">Automatisation des tests et du déploiement avec Jenkins et Codeception.</w:t>
+        <w:t xml:space="preserve">Intégration de Jenkins et Codeception pour automatiser les tests et le déploiement</w:t>
       </w:r>
     </w:p>
     <w:p>
       <w:pPr>
         <w:pStyle w:val="ListParagraph"/>
-        <w:keepNext w:val="false"/>
+        <w:keepNext/>
         <w:keepLines/>
         <w:numPr>
           <w:ilvl w:val="0"/>
@@ -1419,7 +1570,33 @@
           <w:sz w:val="18"/>
           <w:szCs w:val="18"/>
         </w:rPr>
-        <w:t xml:space="preserve">Validation et mise en production des livrables.</w:t>
+        <w:t xml:space="preserve">Validation et mise en production des livrables</w:t>
+      </w:r>
+    </w:p>
+    <w:p>
+      <w:pPr>
+        <w:spacing w:after="20" w:before="20"/>
+        <w:ind w:left="760"/>
+      </w:pPr>
+      <w:r>
+        <w:rPr>
+          <w:rFonts w:ascii="Arial" w:cs="Arial" w:eastAsia="Arial" w:hAnsi="Arial"/>
+          <w:b/>
+          <w:bCs/>
+          <w:color w:val="111827"/>
+          <w:sz w:val="17"/>
+          <w:szCs w:val="17"/>
+        </w:rPr>
+        <w:t xml:space="preserve">Stack : </w:t>
+      </w:r>
+      <w:r>
+        <w:rPr>
+          <w:rFonts w:ascii="Arial" w:cs="Arial" w:eastAsia="Arial" w:hAnsi="Arial"/>
+          <w:color w:val="6B7280"/>
+          <w:sz w:val="17"/>
+          <w:szCs w:val="17"/>
+        </w:rPr>
+        <w:t xml:space="preserve">Symfony 2.8, Python, Jenkins, Codeception, Linux, Git</w:t>
       </w:r>
     </w:p>
     <w:p>
@@ -1433,7 +1610,7 @@
       </w:pPr>
       <w:r>
         <w:drawing>
-          <wp:anchor distT="0" distB="0" distL="0" distR="0" simplePos="0" allowOverlap="1" behindDoc="1" locked="0" layoutInCell="1" relativeHeight="723900">
+          <wp:anchor distT="0" distB="0" distL="0" distR="0" simplePos="0" allowOverlap="1" behindDoc="1" locked="0" layoutInCell="1" relativeHeight="863632">
             <wp:simplePos x="0" y="0"/>
             <wp:positionH relativeFrom="margin">
               <wp:posOffset>0</wp:posOffset>
@@ -1441,7 +1618,7 @@
             <wp:positionV relativeFrom="paragraph">
               <wp:posOffset>-50800</wp:posOffset>
             </wp:positionV>
-            <wp:extent cx="431768" cy="723900"/>
+            <wp:extent cx="431768" cy="863632"/>
             <wp:effectExtent t="0" r="0" b="0" l="0"/>
             <wp:wrapNone/>
             <wp:docPr id="7" name="git-ARG" descr="Graphe du parcours : ARG" title="Parcours"/>
@@ -1467,7 +1644,7 @@
                   <pic:spPr bwMode="auto">
                     <a:xfrm>
                       <a:off x="0" y="0"/>
-                      <a:ext cx="431768" cy="723900"/>
+                      <a:ext cx="431768" cy="863632"/>
                     </a:xfrm>
                     <a:prstGeom prst="rect">
                       <a:avLst/>
@@ -1547,13 +1724,13 @@
           <w:sz w:val="18"/>
           <w:szCs w:val="18"/>
         </w:rPr>
-        <w:t xml:space="preserve">Applications mobiles natives et hybrides.</w:t>
+        <w:t xml:space="preserve">Développement d'applications mobiles natives et hybrides, dont P/T Slider pour Climalife (Google Play)</w:t>
       </w:r>
     </w:p>
     <w:p>
       <w:pPr>
         <w:pStyle w:val="ListParagraph"/>
-        <w:keepNext w:val="false"/>
+        <w:keepNext/>
         <w:keepLines/>
         <w:numPr>
           <w:ilvl w:val="0"/>
@@ -1568,7 +1745,33 @@
           <w:sz w:val="18"/>
           <w:szCs w:val="18"/>
         </w:rPr>
-        <w:t xml:space="preserve">Développement Symfony 2.8 ; contributions Drupal et WordPress.</w:t>
+        <w:t xml:space="preserve">Développement sous Symfony 2.8 ; participation au développement sur Drupal et WordPress</w:t>
+      </w:r>
+    </w:p>
+    <w:p>
+      <w:pPr>
+        <w:spacing w:after="20" w:before="20"/>
+        <w:ind w:left="760"/>
+      </w:pPr>
+      <w:r>
+        <w:rPr>
+          <w:rFonts w:ascii="Arial" w:cs="Arial" w:eastAsia="Arial" w:hAnsi="Arial"/>
+          <w:b/>
+          <w:bCs/>
+          <w:color w:val="111827"/>
+          <w:sz w:val="17"/>
+          <w:szCs w:val="17"/>
+        </w:rPr>
+        <w:t xml:space="preserve">Stack : </w:t>
+      </w:r>
+      <w:r>
+        <w:rPr>
+          <w:rFonts w:ascii="Arial" w:cs="Arial" w:eastAsia="Arial" w:hAnsi="Arial"/>
+          <w:color w:val="6B7280"/>
+          <w:sz w:val="17"/>
+          <w:szCs w:val="17"/>
+        </w:rPr>
+        <w:t xml:space="preserve">Symfony 2.8, Android, Drupal, WordPress, Git</w:t>
       </w:r>
     </w:p>
     <w:p>
@@ -1618,7 +1821,7 @@
         </w:rPr>
         <w:t xml:space="preserve">  ·  </w:t>
       </w:r>
-      <w:hyperlink w:history="1" r:id="rIdkyzqbgs5xrnbkoibpg7lt">
+      <w:hyperlink w:history="1" r:id="rId6j2f14r6rtkq2rq29_zdb">
         <w:r>
           <w:rPr>
             <w:rFonts w:ascii="Arial" w:cs="Arial" w:eastAsia="Arial" w:hAnsi="Arial"/>
@@ -1663,7 +1866,7 @@
           <w:sz w:val="18"/>
           <w:szCs w:val="18"/>
         </w:rPr>
-        <w:t xml:space="preserve">Caisse (POS), écran cuisine (KDS), borne de commande, menu unique synchronisé sur toutes les plateformes.</w:t>
+        <w:t xml:space="preserve">Caisse (POS), écran cuisine (KDS), borne de commande et menu unique synchronisé sur toutes les plateformes</w:t>
       </w:r>
     </w:p>
     <w:p>
@@ -1684,7 +1887,7 @@
           <w:sz w:val="18"/>
           <w:szCs w:val="18"/>
         </w:rPr>
-        <w:t xml:space="preserve">Détection et contestation automatiques des litiges plateformes ; abonnements Stripe ; webhooks temps réel.</w:t>
+        <w:t xml:space="preserve">Détection et contestation automatiques des litiges et remboursements des plateformes</w:t>
       </w:r>
     </w:p>
     <w:p>
@@ -1705,7 +1908,32 @@
           <w:sz w:val="18"/>
           <w:szCs w:val="18"/>
         </w:rPr>
-        <w:t xml:space="preserve">Stack : PHP 8.4, Symfony 7, GraphQL, Vue 3, TypeScript, MySQL, Redis, Docker, Traefik.</w:t>
+        <w:t xml:space="preserve">Abonnements Stripe, webhooks temps réel, déploiement continu sur serveur auto-hébergé</w:t>
+      </w:r>
+    </w:p>
+    <w:p>
+      <w:pPr>
+        <w:spacing w:after="40" w:before="20"/>
+      </w:pPr>
+      <w:r>
+        <w:rPr>
+          <w:rFonts w:ascii="Arial" w:cs="Arial" w:eastAsia="Arial" w:hAnsi="Arial"/>
+          <w:b/>
+          <w:bCs/>
+          <w:color w:val="111827"/>
+          <w:sz w:val="17"/>
+          <w:szCs w:val="17"/>
+        </w:rPr>
+        <w:t xml:space="preserve">Stack : </w:t>
+      </w:r>
+      <w:r>
+        <w:rPr>
+          <w:rFonts w:ascii="Arial" w:cs="Arial" w:eastAsia="Arial" w:hAnsi="Arial"/>
+          <w:color w:val="6B7280"/>
+          <w:sz w:val="17"/>
+          <w:szCs w:val="17"/>
+        </w:rPr>
+        <w:t xml:space="preserve">PHP 8.4, Symfony 7, GraphQL, Vue 3, TypeScript, MySQL, Redis, Stripe, Docker, Traefik</w:t>
       </w:r>
     </w:p>
     <w:p>
@@ -1733,7 +1961,7 @@
         </w:rPr>
         <w:t xml:space="preserve">  ·  </w:t>
       </w:r>
-      <w:hyperlink w:history="1" r:id="rIdy18a136jfvvktlrdhrpnk">
+      <w:hyperlink w:history="1" r:id="rIdans0rq-5bxsx81zj0wsoe">
         <w:r>
           <w:rPr>
             <w:rFonts w:ascii="Arial" w:cs="Arial" w:eastAsia="Arial" w:hAnsi="Arial"/>
@@ -1785,7 +2013,7 @@
         </w:rPr>
         <w:t xml:space="preserve">  ·  </w:t>
       </w:r>
-      <w:hyperlink w:history="1" r:id="rIdsex8coa2a9bogg4-ccvch">
+      <w:hyperlink w:history="1" r:id="rIds4nc-q3vstu4qyuvemrhd">
         <w:r>
           <w:rPr>
             <w:rFonts w:ascii="Arial" w:cs="Arial" w:eastAsia="Arial" w:hAnsi="Arial"/>
@@ -1837,7 +2065,7 @@
         </w:rPr>
         <w:t xml:space="preserve">  ·  </w:t>
       </w:r>
-      <w:hyperlink w:history="1" r:id="rIdkcvskwoejyvsb2tjvayq4">
+      <w:hyperlink w:history="1" r:id="rIdn4dme9qmzdkibixru0_m9">
         <w:r>
           <w:rPr>
             <w:rFonts w:ascii="Arial" w:cs="Arial" w:eastAsia="Arial" w:hAnsi="Arial"/>
@@ -1889,7 +2117,7 @@
         </w:rPr>
         <w:t xml:space="preserve">  ·  </w:t>
       </w:r>
-      <w:hyperlink w:history="1" r:id="rIdxqlhienrvz-hliygdrpvf">
+      <w:hyperlink w:history="1" r:id="rIduppqa_1fppydgo5c-jpii">
         <w:r>
           <w:rPr>
             <w:rFonts w:ascii="Arial" w:cs="Arial" w:eastAsia="Arial" w:hAnsi="Arial"/>
@@ -1941,7 +2169,7 @@
         </w:rPr>
         <w:t xml:space="preserve">  ·  </w:t>
       </w:r>
-      <w:hyperlink w:history="1" r:id="rIdu6a_a-prves968azigc8d">
+      <w:hyperlink w:history="1" r:id="rIdc4ollwhpzfzkdoll5rblz">
         <w:r>
           <w:rPr>
             <w:rFonts w:ascii="Arial" w:cs="Arial" w:eastAsia="Arial" w:hAnsi="Arial"/>

</xml_diff>